<commit_message>
Prepare Renault Master Cargo Market prototype for ETS2 1.61
</commit_message>
<xml_diff>
--- a/docs/ETS2_Renault_Master_Agreed_Spec.docx
+++ b/docs/ETS2_Renault_Master_Agreed_Spec.docx
@@ -350,7 +350,7 @@
               <w:rPr>
                 <w:sz w:val="17"/>
               </w:rPr>
-              <w:t>Пользователь ещё не устанавливал и не проверял исходный мод в игре</w:t>
+              <w:t>Пользователь проверил диагностическую объединённую сборку: покупка у Renault, поездка, перезапуск, повторная загрузка сохранения, руль и педали работают. Присланный журнал содержит ошибки ресурсов и предупреждения; полная совместимость ещё не подтверждена</w:t>
             </w:r>
           </w:p>
         </w:tc>
@@ -794,16 +794,16 @@
         <w:pStyle w:val="ListBullet"/>
       </w:pPr>
       <w:r>
-        <w:t xml:space="preserve">Пользователь выбрал запрет технической прицепной механики: </w:t>
+        <w:t xml:space="preserve">Последующим ответом пользователь </w:t>
       </w:r>
       <w:r>
         <w:rPr>
           <w:b/>
         </w:rPr>
-        <w:t>«никаких действий с прицепом»</w:t>
+        <w:t>разрешил невидимую служебную прицепную сущность</w:t>
       </w:r>
       <w:r>
-        <w:t>. Отдельная покупка, сцепка, расцепка или иные действия с прицепом не должны входить в процесс перевозки.</w:t>
+        <w:t>, если она позволяет брать оплачиваемые заказы на этом автомобиле. Видимых частей и груза за пределами фургона быть не должно.</w:t>
       </w:r>
     </w:p>
     <w:p>
@@ -811,7 +811,32 @@
         <w:pStyle w:val="ListBullet"/>
       </w:pPr>
       <w:r>
-        <w:t xml:space="preserve">Одновременно пользователь выбрал режим </w:t>
+        <w:t xml:space="preserve">Последующим согласованием пользователь </w:t>
+      </w:r>
+      <w:r>
+        <w:rPr>
+          <w:b/>
+        </w:rPr>
+        <w:t>разрешил покупку/активацию своего личного служебного прицепа и его штатное подключение</w:t>
+      </w:r>
+      <w:r>
+        <w:t>. Заказы выбираются в рынке грузов для своего прицепа. Требование полностью автоматической начальной сцепки для первого прототипа снято.</w:t>
+      </w:r>
+    </w:p>
+    <w:p>
+      <w:pPr>
+        <w:pStyle w:val="ListBullet"/>
+      </w:pPr>
+      <w:r>
+        <w:t>Минимизировать собственную массу и влияние на управление. Для прототипа используется служебная масса 5 кг, одна скрытая ось, скрытая геометрия и пустые коллизии. Это не выключает физику прицепа; влияние нужно измерить поездкой. Не приписывать прототипу нулевую физику или подтверждённую автоматическую сцепку.</w:t>
+      </w:r>
+    </w:p>
+    <w:p>
+      <w:pPr>
+        <w:pStyle w:val="ListBullet"/>
+      </w:pPr>
+      <w:r>
+        <w:t xml:space="preserve">Использовать </w:t>
       </w:r>
       <w:r>
         <w:rPr>
@@ -820,16 +845,7 @@
         <w:t>Cargo Market — «со своим прицепом»</w:t>
       </w:r>
       <w:r>
-        <w:t xml:space="preserve">. Это сочетание с запретом прицепной механики </w:t>
-      </w:r>
-      <w:r>
-        <w:rPr>
-          <w:b/>
-        </w:rPr>
-        <w:t>требует технической проверки</w:t>
-      </w:r>
-      <w:r>
-        <w:t>. Нельзя считать скрытый прицеп согласованным решением только из-за выбора Cargo Market. Если игра требует прицеп для этого рынка, такую зависимость необходимо явно показать как ограничение реализации, а не молча заменить требуемый процесс.</w:t>
+        <w:t>. Покупку, подключение, погрузку, сдачу и сохранение нужно подтвердить игровым тестом. Новые заказы должны работать через штатный интерфейс рынка грузов.</w:t>
       </w:r>
     </w:p>
     <w:p>
@@ -883,7 +899,16 @@
     </w:p>
     <w:p>
       <w:r>
-        <w:t>Ограничение длины рейса и отсутствие прицепных действий являются требованиями пользователя. Их фактическая поддержка средствами игры пока не подтверждена.</w:t>
+        <w:t xml:space="preserve">Максимальная длина задания задаётся отдельным </w:t>
+      </w:r>
+      <w:r>
+        <w:rPr>
+          <w:rFonts w:ascii="Noto Sans Mono" w:hAnsi="Noto Sans Mono"/>
+        </w:rPr>
+        <w:t>maximum_distance: 1000</w:t>
+      </w:r>
+      <w:r>
+        <w:t xml:space="preserve"> для новых грузов; применяемое игрой расстояние проверяется рейсом. Первоначальное штатное подключение собственного служебного прицепа согласовано.</w:t>
       </w:r>
     </w:p>
     <w:p>
@@ -1270,7 +1295,16 @@
     <w:p/>
     <w:p>
       <w:r>
-        <w:t>Числа в последней колонке сохранены из ответа пользователя. Для коробок и пустой тары не установлено, означает ли «1» одну упаковку или один комплект груза на рейс. Габариты предметов, палет и комплектов необходимо сопоставить с реальной геометрией кузова; указание «кухня» не означает, что полный гарнитур любого размера заведомо помещается в автомобиль.</w:t>
+        <w:t xml:space="preserve">Последующим ответом уточнено: </w:t>
+      </w:r>
+      <w:r>
+        <w:rPr>
+          <w:b/>
+        </w:rPr>
+        <w:t>«1» — один физический предмет</w:t>
+      </w:r>
+      <w:r>
+        <w:t>. Прежняя таблица содержит примеры, а не окончательные минимумы партий. Для всех категорий количество может меняться от одного предмета до вместимости кузова и общей массы 1200 кг; например, один шкаф весит около 80–100 кг. Реальные масса и габариты каждой партии определяются отдельно. Лимит массы не означает, что 1200 кг пустых коробок, собранных шкафов или полный кухонный гарнитур помещаются в этот кузов: объём также ограничивает число предметов.</w:t>
       </w:r>
     </w:p>
     <w:p>
@@ -1459,7 +1493,53 @@
     </w:p>
     <w:p>
       <w:r>
-        <w:t>Это приблизительный целевой уровень оплаты. Валюта интерфейса игры и правила пересчёта в неё пока не указаны. Влияние штатных навыков, бонусов, штрафов и игровых механизмов экономики нужно определить при проверке; наличие этих механизмов не подтверждает точное совпадение итоговой суммы с формулой.</w:t>
+        <w:t xml:space="preserve">Ставка относится к </w:t>
+      </w:r>
+      <w:r>
+        <w:rPr>
+          <w:b/>
+        </w:rPr>
+        <w:t>всему рейсу до игровых бонусов навыков</w:t>
+      </w:r>
+      <w:r>
+        <w:t>, независимо от числа предметов в партии. Для обычного неценного и нехрупкого груза за 1000 км базовая цель — 1100 USD. Хрупкость и ценность у разных товаров задаются отдельно; штатные бонусы и штрафы продолжают учитываться.</w:t>
+      </w:r>
+    </w:p>
+    <w:p>
+      <w:r>
+        <w:t xml:space="preserve">Пользователь установил курс: </w:t>
+      </w:r>
+      <w:r>
+        <w:rPr>
+          <w:b/>
+        </w:rPr>
+        <w:t>1 EUR = 0,9 USD</w:t>
+      </w:r>
+      <w:r>
+        <w:t xml:space="preserve">, следовательно </w:t>
+      </w:r>
+      <w:r>
+        <w:rPr>
+          <w:rFonts w:ascii="Noto Sans Mono" w:hAnsi="Noto Sans Mono"/>
+        </w:rPr>
+        <w:t>1 USD = 1 / 0,9 EUR</w:t>
+      </w:r>
+      <w:r>
+        <w:t xml:space="preserve">. Обычная ставка равна 1,222222… EUR/км, ценная — 1,666666… EUR/км. Выбранная валюта интерфейса — PLN; в предоставленных игровых определениях </w:t>
+      </w:r>
+      <w:r>
+        <w:rPr>
+          <w:rFonts w:ascii="Noto Sans Mono" w:hAnsi="Noto Sans Mono"/>
+        </w:rPr>
+        <w:t>PLN_ratio = 4,2734</w:t>
+      </w:r>
+      <w:r>
+        <w:t>. Соответственно целевые базовые ставки — около 5,223044 PLN/км и 7,122333 PLN/км. USD в штатном массиве валют отсутствует, поэтому согласованный курс используется при расчёте евро, затем игра переводит их в PLN.</w:t>
+      </w:r>
+    </w:p>
+    <w:p>
+      <w:r>
+        <w:t>Формула движковой базовой цены, фиксированные составляющие и число оплачиваемых грузовых единиц требуют проверки на реальном заказе. Не менять глобальную экономику остальных грузов ради этих ставок. Правильный статический коэффициент не подтверждает точную игровую выплату.</w:t>
       </w:r>
     </w:p>
     <w:p>
@@ -1529,7 +1609,16 @@
     </w:p>
     <w:p>
       <w:r>
-        <w:t>Размещение и смена визуального груза должны соответствовать перевозимому типу настолько, насколько это позволяет проверенная модель и согласованная схема. Наличие подходящей грузовой геометрии без сидений пока не установлено.</w:t>
+        <w:t xml:space="preserve">Пользователь подтвердил по купленному автомобилю: </w:t>
+      </w:r>
+      <w:r>
+        <w:rPr>
+          <w:b/>
+        </w:rPr>
+        <w:t>задних сидений нет</w:t>
+      </w:r>
+      <w:r>
+        <w:t>, за передними сиденьями есть стекло, через которое из салона виден грузовой кузов. Видимый груз нужен. Пользователь предложил PNG вместо стекла при получении заказа; это пример возможного решения, а не обязательная замена стекла. Предпочтительна отдельная плоскость с текстурой или геометрия за сохранённым стеклом, если движок позволяет менять её по заказу. Груз, прикреплённый к поворачивающейся прицепной сущности, не считается соответствующим требованию без проверки, что он всегда остаётся внутри кузова.</w:t>
       </w:r>
     </w:p>
     <w:p>
@@ -1642,34 +1731,240 @@
     </w:p>
     <w:p>
       <w:r>
-        <w:t xml:space="preserve">Пожелание пользователя по топливу: если фактическая комплектация имеет бак </w:t>
+        <w:t xml:space="preserve">Уточнённый режим калибровки: </w:t>
       </w:r>
       <w:r>
         <w:rPr>
           <w:b/>
         </w:rPr>
-        <w:t>60 л</w:t>
+        <w:t>сохранить текущий `g_fuel_simulation=0`</w:t>
       </w:r>
       <w:r>
-        <w:t xml:space="preserve">, расход под нагрузкой при скорости </w:t>
+        <w:t>, не требовать включения реалистичного расхода. При полном баке 60 л и равномерном движении 120–140 км/ч пользователь задал следующие цели:</w:t>
+      </w:r>
+    </w:p>
+    <w:tbl>
+      <w:tblPr>
+        <w:tblStyle w:val="TableGrid"/>
+        <w:tblW w:type="auto" w:w="0"/>
+        <w:tblLook w:firstColumn="1" w:firstRow="1" w:lastColumn="0" w:lastRow="0" w:noHBand="0" w:noVBand="1" w:val="04A0"/>
+      </w:tblPr>
+      <w:tblGrid>
+        <w:gridCol w:w="3289"/>
+        <w:gridCol w:w="3289"/>
+        <w:gridCol w:w="3289"/>
+      </w:tblGrid>
+      <w:tr>
+        <w:trPr>
+          <w:cantSplit/>
+        </w:trPr>
+        <w:tc>
+          <w:tcPr>
+            <w:tcW w:type="dxa" w:w="3289"/>
+          </w:tcPr>
+          <w:p>
+            <w:r>
+              <w:rPr>
+                <w:b/>
+                <w:sz w:val="17"/>
+              </w:rPr>
+              <w:t>Масса груза</w:t>
+            </w:r>
+          </w:p>
+        </w:tc>
+        <w:tc>
+          <w:tcPr>
+            <w:tcW w:type="dxa" w:w="3289"/>
+          </w:tcPr>
+          <w:p>
+            <w:r>
+              <w:rPr>
+                <w:b/>
+                <w:sz w:val="17"/>
+              </w:rPr>
+              <w:t>Запас хода</w:t>
+            </w:r>
+          </w:p>
+        </w:tc>
+        <w:tc>
+          <w:tcPr>
+            <w:tcW w:type="dxa" w:w="3289"/>
+          </w:tcPr>
+          <w:p>
+            <w:r>
+              <w:rPr>
+                <w:b/>
+                <w:sz w:val="17"/>
+              </w:rPr>
+              <w:t>Соответствующий расход</w:t>
+            </w:r>
+          </w:p>
+        </w:tc>
+      </w:tr>
+      <w:tr>
+        <w:trPr>
+          <w:cantSplit/>
+        </w:trPr>
+        <w:tc>
+          <w:tcPr>
+            <w:tcW w:type="dxa" w:w="3289"/>
+          </w:tcPr>
+          <w:p>
+            <w:r>
+              <w:rPr>
+                <w:sz w:val="17"/>
+              </w:rPr>
+              <w:t>0 кг</w:t>
+            </w:r>
+          </w:p>
+        </w:tc>
+        <w:tc>
+          <w:tcPr>
+            <w:tcW w:type="dxa" w:w="3289"/>
+          </w:tcPr>
+          <w:p>
+            <w:r>
+              <w:rPr>
+                <w:sz w:val="17"/>
+              </w:rPr>
+              <w:t>1100 км</w:t>
+            </w:r>
+          </w:p>
+        </w:tc>
+        <w:tc>
+          <w:tcPr>
+            <w:tcW w:type="dxa" w:w="3289"/>
+          </w:tcPr>
+          <w:p>
+            <w:r>
+              <w:rPr>
+                <w:sz w:val="17"/>
+              </w:rPr>
+              <w:t>5,454545… л/100 км</w:t>
+            </w:r>
+          </w:p>
+        </w:tc>
+      </w:tr>
+      <w:tr>
+        <w:trPr>
+          <w:cantSplit/>
+        </w:trPr>
+        <w:tc>
+          <w:tcPr>
+            <w:tcW w:type="dxa" w:w="3289"/>
+          </w:tcPr>
+          <w:p>
+            <w:r>
+              <w:rPr>
+                <w:sz w:val="17"/>
+              </w:rPr>
+              <w:t>600 кг</w:t>
+            </w:r>
+          </w:p>
+        </w:tc>
+        <w:tc>
+          <w:tcPr>
+            <w:tcW w:type="dxa" w:w="3289"/>
+          </w:tcPr>
+          <w:p>
+            <w:r>
+              <w:rPr>
+                <w:sz w:val="17"/>
+              </w:rPr>
+              <w:t>925 км</w:t>
+            </w:r>
+          </w:p>
+        </w:tc>
+        <w:tc>
+          <w:tcPr>
+            <w:tcW w:type="dxa" w:w="3289"/>
+          </w:tcPr>
+          <w:p>
+            <w:r>
+              <w:rPr>
+                <w:sz w:val="17"/>
+              </w:rPr>
+              <w:t>6,486486… л/100 км</w:t>
+            </w:r>
+          </w:p>
+        </w:tc>
+      </w:tr>
+      <w:tr>
+        <w:trPr>
+          <w:cantSplit/>
+        </w:trPr>
+        <w:tc>
+          <w:tcPr>
+            <w:tcW w:type="dxa" w:w="3289"/>
+          </w:tcPr>
+          <w:p>
+            <w:r>
+              <w:rPr>
+                <w:sz w:val="17"/>
+              </w:rPr>
+              <w:t>1200 кг</w:t>
+            </w:r>
+          </w:p>
+        </w:tc>
+        <w:tc>
+          <w:tcPr>
+            <w:tcW w:type="dxa" w:w="3289"/>
+          </w:tcPr>
+          <w:p>
+            <w:r>
+              <w:rPr>
+                <w:sz w:val="17"/>
+              </w:rPr>
+              <w:t>750 км</w:t>
+            </w:r>
+          </w:p>
+        </w:tc>
+        <w:tc>
+          <w:tcPr>
+            <w:tcW w:type="dxa" w:w="3289"/>
+          </w:tcPr>
+          <w:p>
+            <w:r>
+              <w:rPr>
+                <w:sz w:val="17"/>
+              </w:rPr>
+              <w:t>8 л/100 км</w:t>
+            </w:r>
+          </w:p>
+        </w:tc>
+      </w:tr>
+    </w:tbl>
+    <w:p/>
+    <w:p>
+      <w:r>
+        <w:t xml:space="preserve">Интерполяция по согласованной логике: </w:t>
       </w:r>
       <w:r>
         <w:rPr>
-          <w:b/>
+          <w:rFonts w:ascii="Noto Sans Mono" w:hAnsi="Noto Sans Mono"/>
         </w:rPr>
-        <w:t>120–160 км/ч</w:t>
+        <w:t>R(m) = 1100 − 350 × m / 1200</w:t>
       </w:r>
       <w:r>
-        <w:t xml:space="preserve"> должен составлять </w:t>
+        <w:t xml:space="preserve"> км для </w:t>
       </w:r>
       <w:r>
         <w:rPr>
-          <w:b/>
+          <w:rFonts w:ascii="Noto Sans Mono" w:hAnsi="Noto Sans Mono"/>
         </w:rPr>
-        <w:t>не более 8 л/100 км</w:t>
+        <w:t>0 ≤ m ≤ 1200</w:t>
       </w:r>
       <w:r>
-        <w:t>. Это целевой игровой показатель из ответа пользователя, а не подтверждённая реальная характеристика Renault Master. Соответствие фактического расхода этому требованию необходимо проверить поездкой; изменения не должны сводиться к правке текстового описания.</w:t>
+        <w:t xml:space="preserve">; расход </w:t>
+      </w:r>
+      <w:r>
+        <w:rPr>
+          <w:rFonts w:ascii="Noto Sans Mono" w:hAnsi="Noto Sans Mono"/>
+        </w:rPr>
+        <w:t>C(m) = 6000 / R(m)</w:t>
+      </w:r>
+      <w:r>
+        <w:t xml:space="preserve"> л/100 км. Линейна дальность, а не расход. Это целевые игровые показатели, не подтверждённые реальные характеристики Master. Поддержка зависимости от массы в упрощённом режиме и точность калибровки требуют проверки; нельзя обещать её одним коэффициентом двигателя.</w:t>
       </w:r>
     </w:p>
     <w:p>
@@ -1754,10 +2049,19 @@
         <w:rPr>
           <w:b/>
         </w:rPr>
-        <w:t>только личное использование</w:t>
+        <w:t>личное использование</w:t>
       </w:r>
       <w:r>
-        <w:t>, без публикации.</w:t>
+        <w:t xml:space="preserve">. Для передачи файлов пользователь отдельно разрешил использование указанного GitHub-репозитория; он публичный. Не публиковать пользовательские журналы, сохранения и исходный игровой </w:t>
+      </w:r>
+      <w:r>
+        <w:rPr>
+          <w:rFonts w:ascii="Noto Sans Mono" w:hAnsi="Noto Sans Mono"/>
+        </w:rPr>
+        <w:t>def.scs</w:t>
+      </w:r>
+      <w:r>
+        <w:t>.</w:t>
       </w:r>
     </w:p>
     <w:p>
@@ -1828,7 +2132,7 @@
         <w:pStyle w:val="ListNumber"/>
       </w:pPr>
       <w:r>
-        <w:t>Сцепка, парковка, коллизии и управление соответствуют выбранной схеме. При этом критерий о сцепке не отменяет отдельного запрета пользователя на действия с прицепом.</w:t>
+        <w:t>Сцепка, парковка, коллизии и управление соответствуют согласованной невидимой служебной схеме с первоначальным штатным подключением. Влияние на управление минимизировано; невидимость не считается отключённой физикой.</w:t>
       </w:r>
     </w:p>
     <w:p>
@@ -1892,7 +2196,7 @@
         <w:pStyle w:val="ListBullet"/>
       </w:pPr>
       <w:r>
-        <w:t>Операционная система пользователя не указана.</w:t>
+        <w:t>Операционная система подтверждена журналом: Windows 11. Версия — 1.61.1.1s; активен только диагностический Master.</w:t>
       </w:r>
     </w:p>
     <w:p>
@@ -1900,7 +2204,25 @@
         <w:pStyle w:val="ListBullet"/>
       </w:pPr>
       <w:r>
-        <w:t>Валюта игрового интерфейса не указана; необходима проверка пересчёта целевой ставки в USD.</w:t>
+        <w:t xml:space="preserve">В журнале </w:t>
+      </w:r>
+      <w:r>
+        <w:rPr>
+          <w:rFonts w:ascii="Noto Sans Mono" w:hAnsi="Noto Sans Mono"/>
+        </w:rPr>
+        <w:t>g_currency=4</w:t>
+      </w:r>
+      <w:r>
+        <w:t xml:space="preserve">, соответствующее штатному PLN. Пользователь согласовал долларовые ставки и фиксированный курс </w:t>
+      </w:r>
+      <w:r>
+        <w:rPr>
+          <w:rFonts w:ascii="Noto Sans Mono" w:hAnsi="Noto Sans Mono"/>
+        </w:rPr>
+        <w:t>1 EUR = 0,9 USD</w:t>
+      </w:r>
+      <w:r>
+        <w:t>; валютный вопрос решён.</w:t>
       </w:r>
     </w:p>
     <w:p>
@@ -1908,7 +2230,7 @@
         <w:pStyle w:val="ListBullet"/>
       </w:pPr>
       <w:r>
-        <w:t>Исходный Renault Master ещё не проверен пользователем в ETS2 1.61.1.1s.</w:t>
+        <w:t>Базовая машина прошла пользовательский тест поездки и повторной загрузки. В журнале есть ошибки световых элементов, панели и других ресурсов исходного мода; их нужно устранить и проверить отдельно.</w:t>
       </w:r>
     </w:p>
     <w:p>
@@ -1916,7 +2238,16 @@
         <w:pStyle w:val="ListBullet"/>
       </w:pPr>
       <w:r>
-        <w:t>Нужно проверить возможность Cargo Market при полном отсутствии действий с прицепом. Скрытая прицепная механика не согласована.</w:t>
+        <w:t xml:space="preserve">Реалистичный расход в текущем профиле отключён: </w:t>
+      </w:r>
+      <w:r>
+        <w:rPr>
+          <w:rFonts w:ascii="Noto Sans Mono" w:hAnsi="Noto Sans Mono"/>
+        </w:rPr>
+        <w:t>g_fuel_simulation=0</w:t>
+      </w:r>
+      <w:r>
+        <w:t>. Пользователь выбрал сохранить этот режим; остаётся проверка поддержки нужной зависимости расхода от массы.</w:t>
       </w:r>
     </w:p>
     <w:p>
@@ -1924,7 +2255,7 @@
         <w:pStyle w:val="ListBullet"/>
       </w:pPr>
       <w:r>
-        <w:t>Нужно исследовать фактическую геометрию кузова, наличие варианта без задних сидений, окна и возможность видимого груза внутри автомобиля.</w:t>
+        <w:t>Пользователь разрешил невидимую служебную прицепную сущность, покупку/активацию и первоначальную штатную сцепку. Нужно подтвердить минимальное влияние физики и полный цикл Cargo Market.</w:t>
       </w:r>
     </w:p>
     <w:p>
@@ -1932,7 +2263,7 @@
         <w:pStyle w:val="ListBullet"/>
       </w:pPr>
       <w:r>
-        <w:t>Необходима проверка допустимых размеров предметов и трактовки количества «1» для коробок и тары; нельзя обещать вместимость только по массе.</w:t>
+        <w:t>Пользователь подтвердил отсутствие задних сидений и стекло между кабиной и грузовым кузовом; нужно проверить способ привязки и смены видимого груза внутри автомобиля.</w:t>
       </w:r>
     </w:p>
     <w:p>
@@ -1940,7 +2271,24 @@
         <w:pStyle w:val="ListBullet"/>
       </w:pPr>
       <w:r>
-        <w:t>Не подтверждена возможность гарантировать максимум 1000 км для всех создаваемых заказов без изменения штатных заказов.</w:t>
+        <w:t>Количество «1» означает один физический предмет. Необходима проверка допустимых размеров и объёма партий; вместимость не определяется одной массой.</w:t>
+      </w:r>
+    </w:p>
+    <w:p>
+      <w:pPr>
+        <w:pStyle w:val="ListBullet"/>
+      </w:pPr>
+      <w:r>
+        <w:t xml:space="preserve">В реальных определениях грузов 1.61 найден </w:t>
+      </w:r>
+      <w:r>
+        <w:rPr>
+          <w:rFonts w:ascii="Noto Sans Mono" w:hAnsi="Noto Sans Mono"/>
+        </w:rPr>
+        <w:t>maximum_distance</w:t>
+      </w:r>
+      <w:r>
+        <w:t xml:space="preserve"> (например, песок — 800, живые свиньи — 600). Можно закладывать ограничение 1000 для новых грузов; работу ограничения и используемое игрой расстояние нужно проверить рейсом.</w:t>
       </w:r>
     </w:p>
     <w:p>

</xml_diff>